<commit_message>
fix(lab7): replace login screens with authentic terminal execution evidence and update docx report
</commit_message>
<xml_diff>
--- a/LAB7/report/11_DH_TMDT-LAB7_1150070050_NguyenNgocTuVy.docx
+++ b/LAB7/report/11_DH_TMDT-LAB7_1150070050_NguyenNgocTuVy.docx
@@ -324,7 +324,7 @@
                 <w:color w:val="008000"/>
                 <w:sz w:val="17"/>
               </w:rPr>
-              <w:t>PASS</w:t>
+              <w:t>PASS (Hình 3)</w:t>
               <w:br/>
               <w:t>Log: *SCANNED* *TRUSTED* Site match</w:t>
             </w:r>
@@ -447,7 +447,7 @@
                 <w:color w:val="008000"/>
                 <w:sz w:val="17"/>
               </w:rPr>
-              <w:t>PASS</w:t>
+              <w:t>PASS (Hình 4)</w:t>
               <w:br/>
               <w:t>Log: *DENIED* Blocked site: china / mideast</w:t>
             </w:r>
@@ -568,7 +568,7 @@
                 <w:color w:val="008000"/>
                 <w:sz w:val="17"/>
               </w:rPr>
-              <w:t>PASS</w:t>
+              <w:t>PASS (Hình 5)</w:t>
               <w:br/>
               <w:t>Log: *DENIED* Blocked site: jobs.lab7.test</w:t>
             </w:r>
@@ -693,7 +693,7 @@
                 <w:color w:val="008000"/>
                 <w:sz w:val="17"/>
               </w:rPr>
-              <w:t>PASS (Cấu hình &amp; Trang cảnh báo)</w:t>
+              <w:t>PASS (Hình 6)</w:t>
               <w:br/>
               <w:t>Log: *DENIED* Blocked site (Warning Mode)</w:t>
             </w:r>
@@ -814,7 +814,7 @@
                 <w:color w:val="008000"/>
                 <w:sz w:val="17"/>
               </w:rPr>
-              <w:t>PASS</w:t>
+              <w:t>PASS (Hình 7)</w:t>
               <w:br/>
               <w:t>Log: *SCANNED* *TRUSTED* Site match: education</w:t>
             </w:r>
@@ -934,12 +934,12 @@
             <w:r>
               <w:rPr>
                 <w:b/>
-                <w:color w:val="008000"/>
+                <w:color w:val="B46400"/>
                 <w:sz w:val="17"/>
               </w:rPr>
-              <w:t>PASS (Điều kiện phiên lab)</w:t>
+              <w:t>PARTIAL (Điều kiện phiên lab)</w:t>
               <w:br/>
-              <w:t>Chính sách Time-Window sư phạm</w:t>
+              <w:t>Chưa test đủ đồng hồ 60 phút</w:t>
             </w:r>
           </w:p>
         </w:tc>
@@ -1058,7 +1058,7 @@
                 <w:color w:val="008000"/>
                 <w:sz w:val="17"/>
               </w:rPr>
-              <w:t>PASS</w:t>
+              <w:t>PASS (Log thật)</w:t>
               <w:br/>
               <w:t>Log: *DENIED* Blocked site: streaming</w:t>
             </w:r>
@@ -1179,7 +1179,7 @@
                 <w:color w:val="008000"/>
                 <w:sz w:val="17"/>
               </w:rPr>
-              <w:t>PASS</w:t>
+              <w:t>PASS (Hình 8)</w:t>
               <w:br/>
               <w:t>Log: *DENIED* Blocked site: blockedgame</w:t>
             </w:r>
@@ -1300,9 +1300,9 @@
                 <w:color w:val="008000"/>
                 <w:sz w:val="17"/>
               </w:rPr>
-              <w:t>PASS</w:t>
+              <w:t>PASS (Hình 9)</w:t>
               <w:br/>
-              <w:t>Log: *INFECTED* Virus or bad content detected. Eicar-Signature</w:t>
+              <w:t>Log: *INFECTED* Virus Eicar-Signature</w:t>
             </w:r>
           </w:p>
         </w:tc>
@@ -1423,7 +1423,7 @@
                 <w:color w:val="008000"/>
                 <w:sz w:val="17"/>
               </w:rPr>
-              <w:t>PASS</w:t>
+              <w:t>PASS (Hình 10)</w:t>
               <w:br/>
               <w:t>Squid: TCP_DENIED_REPLY/403 ERR_TOO_BIG</w:t>
             </w:r>
@@ -1639,6 +1639,544 @@
     </w:p>
     <w:p>
       <w:r/>
+    </w:p>
+    <w:p>
+      <w:pPr>
+        <w:pStyle w:val="Heading1"/>
+      </w:pPr>
+      <w:r>
+        <w:t>6. Phụ Lục Ảnh Minh Chứng Thực Tế Triển Khai &amp; Kiểm Thử</w:t>
+      </w:r>
+    </w:p>
+    <w:p/>
+    <w:p>
+      <w:pPr>
+        <w:jc w:val="center"/>
+      </w:pPr>
+      <w:r>
+        <w:drawing>
+          <wp:inline xmlns:a="http://schemas.openxmlformats.org/drawingml/2006/main" xmlns:pic="http://schemas.openxmlformats.org/drawingml/2006/picture">
+            <wp:extent cx="5303520" cy="3314700"/>
+            <wp:docPr id="1" name="Picture 1"/>
+            <wp:cNvGraphicFramePr>
+              <a:graphicFrameLocks noChangeAspect="1"/>
+            </wp:cNvGraphicFramePr>
+            <a:graphic>
+              <a:graphicData uri="http://schemas.openxmlformats.org/drawingml/2006/picture">
+                <pic:pic>
+                  <pic:nvPicPr>
+                    <pic:cNvPr id="0" name="dmz_web_status.png"/>
+                    <pic:cNvPicPr/>
+                  </pic:nvPicPr>
+                  <pic:blipFill>
+                    <a:blip r:embed="rId9"/>
+                    <a:stretch>
+                      <a:fillRect/>
+                    </a:stretch>
+                  </pic:blipFill>
+                  <pic:spPr>
+                    <a:xfrm>
+                      <a:off x="0" y="0"/>
+                      <a:ext cx="5303520" cy="3314700"/>
+                    </a:xfrm>
+                    <a:prstGeom prst="rect"/>
+                  </pic:spPr>
+                </pic:pic>
+              </a:graphicData>
+            </a:graphic>
+          </wp:inline>
+        </w:drawing>
+      </w:r>
+    </w:p>
+    <w:p>
+      <w:pPr>
+        <w:jc w:val="center"/>
+      </w:pPr>
+      <w:r>
+        <w:rPr>
+          <w:i/>
+          <w:color w:val="505050"/>
+          <w:sz w:val="18"/>
+        </w:rPr>
+        <w:t>Hình 1: Trạng thái máy chủ DMZ-WEB (IP 172.16.6.10, Nginx active, các tệp kiểm thử 10M/100M/110M/EICAR)</w:t>
+      </w:r>
+    </w:p>
+    <w:p/>
+    <w:p>
+      <w:pPr>
+        <w:jc w:val="center"/>
+      </w:pPr>
+      <w:r>
+        <w:drawing>
+          <wp:inline xmlns:a="http://schemas.openxmlformats.org/drawingml/2006/main" xmlns:pic="http://schemas.openxmlformats.org/drawingml/2006/picture">
+            <wp:extent cx="5303520" cy="3314700"/>
+            <wp:docPr id="2" name="Picture 2"/>
+            <wp:cNvGraphicFramePr>
+              <a:graphicFrameLocks noChangeAspect="1"/>
+            </wp:cNvGraphicFramePr>
+            <a:graphic>
+              <a:graphicData uri="http://schemas.openxmlformats.org/drawingml/2006/picture">
+                <pic:pic>
+                  <pic:nvPicPr>
+                    <pic:cNvPr id="0" name="web_proxy_services.png"/>
+                    <pic:cNvPicPr/>
+                  </pic:nvPicPr>
+                  <pic:blipFill>
+                    <a:blip r:embed="rId10"/>
+                    <a:stretch>
+                      <a:fillRect/>
+                    </a:stretch>
+                  </pic:blipFill>
+                  <pic:spPr>
+                    <a:xfrm>
+                      <a:off x="0" y="0"/>
+                      <a:ext cx="5303520" cy="3314700"/>
+                    </a:xfrm>
+                    <a:prstGeom prst="rect"/>
+                  </pic:spPr>
+                </pic:pic>
+              </a:graphicData>
+            </a:graphic>
+          </wp:inline>
+        </w:drawing>
+      </w:r>
+    </w:p>
+    <w:p>
+      <w:pPr>
+        <w:jc w:val="center"/>
+      </w:pPr>
+      <w:r>
+        <w:rPr>
+          <w:i/>
+          <w:color w:val="505050"/>
+          <w:sz w:val="18"/>
+        </w:rPr>
+        <w:t>Hình 2: Trạng thái các dịch vụ lõi trên WEB-PROXY (IP 10.6.0.30, Squid, E2Guardian và ClamAV active)</w:t>
+      </w:r>
+    </w:p>
+    <w:p/>
+    <w:p>
+      <w:pPr>
+        <w:jc w:val="center"/>
+      </w:pPr>
+      <w:r>
+        <w:drawing>
+          <wp:inline xmlns:a="http://schemas.openxmlformats.org/drawingml/2006/main" xmlns:pic="http://schemas.openxmlformats.org/drawingml/2006/picture">
+            <wp:extent cx="5303520" cy="3314700"/>
+            <wp:docPr id="3" name="Picture 3"/>
+            <wp:cNvGraphicFramePr>
+              <a:graphicFrameLocks noChangeAspect="1"/>
+            </wp:cNvGraphicFramePr>
+            <a:graphic>
+              <a:graphicData uri="http://schemas.openxmlformats.org/drawingml/2006/picture">
+                <pic:pic>
+                  <pic:nvPicPr>
+                    <pic:cNvPr id="0" name="kb1_normal_allowed.png"/>
+                    <pic:cNvPicPr/>
+                  </pic:nvPicPr>
+                  <pic:blipFill>
+                    <a:blip r:embed="rId11"/>
+                    <a:stretch>
+                      <a:fillRect/>
+                    </a:stretch>
+                  </pic:blipFill>
+                  <pic:spPr>
+                    <a:xfrm>
+                      <a:off x="0" y="0"/>
+                      <a:ext cx="5303520" cy="3314700"/>
+                    </a:xfrm>
+                    <a:prstGeom prst="rect"/>
+                  </pic:spPr>
+                </pic:pic>
+              </a:graphicData>
+            </a:graphic>
+          </wp:inline>
+        </w:drawing>
+      </w:r>
+    </w:p>
+    <w:p>
+      <w:pPr>
+        <w:jc w:val="center"/>
+      </w:pPr>
+      <w:r>
+        <w:rPr>
+          <w:i/>
+          <w:color w:val="505050"/>
+          <w:sz w:val="18"/>
+        </w:rPr>
+        <w:t>Hình 3 - KB1: Kiểm thử trang bình thường (normal.lab7.test) được phép qua proxy với mã trạng thái HTTP 200 OK</w:t>
+      </w:r>
+    </w:p>
+    <w:p/>
+    <w:p>
+      <w:pPr>
+        <w:jc w:val="center"/>
+      </w:pPr>
+      <w:r>
+        <w:drawing>
+          <wp:inline xmlns:a="http://schemas.openxmlformats.org/drawingml/2006/main" xmlns:pic="http://schemas.openxmlformats.org/drawingml/2006/picture">
+            <wp:extent cx="5303520" cy="3314700"/>
+            <wp:docPr id="4" name="Picture 4"/>
+            <wp:cNvGraphicFramePr>
+              <a:graphicFrameLocks noChangeAspect="1"/>
+            </wp:cNvGraphicFramePr>
+            <a:graphic>
+              <a:graphicData uri="http://schemas.openxmlformats.org/drawingml/2006/picture">
+                <pic:pic>
+                  <pic:nvPicPr>
+                    <pic:cNvPr id="0" name="kb2_geo_blocked.png"/>
+                    <pic:cNvPicPr/>
+                  </pic:nvPicPr>
+                  <pic:blipFill>
+                    <a:blip r:embed="rId12"/>
+                    <a:stretch>
+                      <a:fillRect/>
+                    </a:stretch>
+                  </pic:blipFill>
+                  <pic:spPr>
+                    <a:xfrm>
+                      <a:off x="0" y="0"/>
+                      <a:ext cx="5303520" cy="3314700"/>
+                    </a:xfrm>
+                    <a:prstGeom prst="rect"/>
+                  </pic:spPr>
+                </pic:pic>
+              </a:graphicData>
+            </a:graphic>
+          </wp:inline>
+        </w:drawing>
+      </w:r>
+    </w:p>
+    <w:p>
+      <w:pPr>
+        <w:jc w:val="center"/>
+      </w:pPr>
+      <w:r>
+        <w:rPr>
+          <w:i/>
+          <w:color w:val="505050"/>
+          <w:sz w:val="18"/>
+        </w:rPr>
+        <w:t>Hình 4 - KB2: E2Guardian chặn trang Geo-Sim mô phỏng (china.lab7.test) với mã lỗi 403 Access Denied</w:t>
+      </w:r>
+    </w:p>
+    <w:p/>
+    <w:p>
+      <w:pPr>
+        <w:jc w:val="center"/>
+      </w:pPr>
+      <w:r>
+        <w:drawing>
+          <wp:inline xmlns:a="http://schemas.openxmlformats.org/drawingml/2006/main" xmlns:pic="http://schemas.openxmlformats.org/drawingml/2006/picture">
+            <wp:extent cx="5303520" cy="3314700"/>
+            <wp:docPr id="5" name="Picture 5"/>
+            <wp:cNvGraphicFramePr>
+              <a:graphicFrameLocks noChangeAspect="1"/>
+            </wp:cNvGraphicFramePr>
+            <a:graphic>
+              <a:graphicData uri="http://schemas.openxmlformats.org/drawingml/2006/picture">
+                <pic:pic>
+                  <pic:nvPicPr>
+                    <pic:cNvPr id="0" name="kb3_job_blocked.png"/>
+                    <pic:cNvPicPr/>
+                  </pic:nvPicPr>
+                  <pic:blipFill>
+                    <a:blip r:embed="rId13"/>
+                    <a:stretch>
+                      <a:fillRect/>
+                    </a:stretch>
+                  </pic:blipFill>
+                  <pic:spPr>
+                    <a:xfrm>
+                      <a:off x="0" y="0"/>
+                      <a:ext cx="5303520" cy="3314700"/>
+                    </a:xfrm>
+                    <a:prstGeom prst="rect"/>
+                  </pic:spPr>
+                </pic:pic>
+              </a:graphicData>
+            </a:graphic>
+          </wp:inline>
+        </w:drawing>
+      </w:r>
+    </w:p>
+    <w:p>
+      <w:pPr>
+        <w:jc w:val="center"/>
+      </w:pPr>
+      <w:r>
+        <w:rPr>
+          <w:i/>
+          <w:color w:val="505050"/>
+          <w:sz w:val="18"/>
+        </w:rPr>
+        <w:t>Hình 5 - KB3: E2Guardian chặn danh mục tìm kiếm việc làm (jobs.lab7.test) không có liên kết bypass</w:t>
+      </w:r>
+    </w:p>
+    <w:p/>
+    <w:p>
+      <w:pPr>
+        <w:jc w:val="center"/>
+      </w:pPr>
+      <w:r>
+        <w:drawing>
+          <wp:inline xmlns:a="http://schemas.openxmlformats.org/drawingml/2006/main" xmlns:pic="http://schemas.openxmlformats.org/drawingml/2006/picture">
+            <wp:extent cx="5303520" cy="3314700"/>
+            <wp:docPr id="6" name="Picture 6"/>
+            <wp:cNvGraphicFramePr>
+              <a:graphicFrameLocks noChangeAspect="1"/>
+            </wp:cNvGraphicFramePr>
+            <a:graphic>
+              <a:graphicData uri="http://schemas.openxmlformats.org/drawingml/2006/picture">
+                <pic:pic>
+                  <pic:nvPicPr>
+                    <pic:cNvPr id="0" name="kb4_warning_bypass.png"/>
+                    <pic:cNvPicPr/>
+                  </pic:nvPicPr>
+                  <pic:blipFill>
+                    <a:blip r:embed="rId14"/>
+                    <a:stretch>
+                      <a:fillRect/>
+                    </a:stretch>
+                  </pic:blipFill>
+                  <pic:spPr>
+                    <a:xfrm>
+                      <a:off x="0" y="0"/>
+                      <a:ext cx="5303520" cy="3314700"/>
+                    </a:xfrm>
+                    <a:prstGeom prst="rect"/>
+                  </pic:spPr>
+                </pic:pic>
+              </a:graphicData>
+            </a:graphic>
+          </wp:inline>
+        </w:drawing>
+      </w:r>
+    </w:p>
+    <w:p>
+      <w:pPr>
+        <w:jc w:val="center"/>
+      </w:pPr>
+      <w:r>
+        <w:rPr>
+          <w:i/>
+          <w:color w:val="505050"/>
+          <w:sz w:val="18"/>
+        </w:rPr>
+        <w:t>Hình 6 - KB4: Trang cảnh báo tiếng Việt cho site nhạy cảm (weapons.lab7.test) kèm liên kết Temporary Bypass 300 giây</w:t>
+      </w:r>
+    </w:p>
+    <w:p/>
+    <w:p>
+      <w:pPr>
+        <w:jc w:val="center"/>
+      </w:pPr>
+      <w:r>
+        <w:drawing>
+          <wp:inline xmlns:a="http://schemas.openxmlformats.org/drawingml/2006/main" xmlns:pic="http://schemas.openxmlformats.org/drawingml/2006/picture">
+            <wp:extent cx="5303520" cy="3314700"/>
+            <wp:docPr id="7" name="Picture 7"/>
+            <wp:cNvGraphicFramePr>
+              <a:graphicFrameLocks noChangeAspect="1"/>
+            </wp:cNvGraphicFramePr>
+            <a:graphic>
+              <a:graphicData uri="http://schemas.openxmlformats.org/drawingml/2006/picture">
+                <pic:pic>
+                  <pic:nvPicPr>
+                    <pic:cNvPr id="0" name="kb5_education_allowed.png"/>
+                    <pic:cNvPicPr/>
+                  </pic:nvPicPr>
+                  <pic:blipFill>
+                    <a:blip r:embed="rId15"/>
+                    <a:stretch>
+                      <a:fillRect/>
+                    </a:stretch>
+                  </pic:blipFill>
+                  <pic:spPr>
+                    <a:xfrm>
+                      <a:off x="0" y="0"/>
+                      <a:ext cx="5303520" cy="3314700"/>
+                    </a:xfrm>
+                    <a:prstGeom prst="rect"/>
+                  </pic:spPr>
+                </pic:pic>
+              </a:graphicData>
+            </a:graphic>
+          </wp:inline>
+        </w:drawing>
+      </w:r>
+    </w:p>
+    <w:p>
+      <w:pPr>
+        <w:jc w:val="center"/>
+      </w:pPr>
+      <w:r>
+        <w:rPr>
+          <w:i/>
+          <w:color w:val="505050"/>
+          <w:sz w:val="18"/>
+        </w:rPr>
+        <w:t>Hình 7 - KB5: Tên miền giáo dục (education.lab7.test) nằm trong exceptionsitelist được phép truy cập trực tiếp</w:t>
+      </w:r>
+    </w:p>
+    <w:p/>
+    <w:p>
+      <w:pPr>
+        <w:jc w:val="center"/>
+      </w:pPr>
+      <w:r>
+        <w:drawing>
+          <wp:inline xmlns:a="http://schemas.openxmlformats.org/drawingml/2006/main" xmlns:pic="http://schemas.openxmlformats.org/drawingml/2006/picture">
+            <wp:extent cx="5303520" cy="3314700"/>
+            <wp:docPr id="8" name="Picture 8"/>
+            <wp:cNvGraphicFramePr>
+              <a:graphicFrameLocks noChangeAspect="1"/>
+            </wp:cNvGraphicFramePr>
+            <a:graphic>
+              <a:graphicData uri="http://schemas.openxmlformats.org/drawingml/2006/picture">
+                <pic:pic>
+                  <pic:nvPicPr>
+                    <pic:cNvPr id="0" name="kb8_blockedgame.png"/>
+                    <pic:cNvPicPr/>
+                  </pic:nvPicPr>
+                  <pic:blipFill>
+                    <a:blip r:embed="rId16"/>
+                    <a:stretch>
+                      <a:fillRect/>
+                    </a:stretch>
+                  </pic:blipFill>
+                  <pic:spPr>
+                    <a:xfrm>
+                      <a:off x="0" y="0"/>
+                      <a:ext cx="5303520" cy="3314700"/>
+                    </a:xfrm>
+                    <a:prstGeom prst="rect"/>
+                  </pic:spPr>
+                </pic:pic>
+              </a:graphicData>
+            </a:graphic>
+          </wp:inline>
+        </w:drawing>
+      </w:r>
+    </w:p>
+    <w:p>
+      <w:pPr>
+        <w:jc w:val="center"/>
+      </w:pPr>
+      <w:r>
+        <w:rPr>
+          <w:i/>
+          <w:color w:val="505050"/>
+          <w:sz w:val="18"/>
+        </w:rPr>
+        <w:t>Hình 8 - KB8: Chặn cứng game cụ thể (blockedgame.lab7.test) trong danh sách domainsnobypass</w:t>
+      </w:r>
+    </w:p>
+    <w:p/>
+    <w:p>
+      <w:pPr>
+        <w:jc w:val="center"/>
+      </w:pPr>
+      <w:r>
+        <w:drawing>
+          <wp:inline xmlns:a="http://schemas.openxmlformats.org/drawingml/2006/main" xmlns:pic="http://schemas.openxmlformats.org/drawingml/2006/picture">
+            <wp:extent cx="5303520" cy="3314700"/>
+            <wp:docPr id="9" name="Picture 9"/>
+            <wp:cNvGraphicFramePr>
+              <a:graphicFrameLocks noChangeAspect="1"/>
+            </wp:cNvGraphicFramePr>
+            <a:graphic>
+              <a:graphicData uri="http://schemas.openxmlformats.org/drawingml/2006/picture">
+                <pic:pic>
+                  <pic:nvPicPr>
+                    <pic:cNvPr id="0" name="kb9_clamav_eicar.png"/>
+                    <pic:cNvPicPr/>
+                  </pic:nvPicPr>
+                  <pic:blipFill>
+                    <a:blip r:embed="rId17"/>
+                    <a:stretch>
+                      <a:fillRect/>
+                    </a:stretch>
+                  </pic:blipFill>
+                  <pic:spPr>
+                    <a:xfrm>
+                      <a:off x="0" y="0"/>
+                      <a:ext cx="5303520" cy="3314700"/>
+                    </a:xfrm>
+                    <a:prstGeom prst="rect"/>
+                  </pic:spPr>
+                </pic:pic>
+              </a:graphicData>
+            </a:graphic>
+          </wp:inline>
+        </w:drawing>
+      </w:r>
+    </w:p>
+    <w:p>
+      <w:pPr>
+        <w:jc w:val="center"/>
+      </w:pPr>
+      <w:r>
+        <w:rPr>
+          <w:i/>
+          <w:color w:val="505050"/>
+          <w:sz w:val="18"/>
+        </w:rPr>
+        <w:t>Hình 9 - KB9: ClamAV Daemon phát hiện mã độc EICAR và ngắt kết nối tải về (*INFECTED* Eicar-Signature)</w:t>
+      </w:r>
+    </w:p>
+    <w:p/>
+    <w:p>
+      <w:pPr>
+        <w:jc w:val="center"/>
+      </w:pPr>
+      <w:r>
+        <w:drawing>
+          <wp:inline xmlns:a="http://schemas.openxmlformats.org/drawingml/2006/main" xmlns:pic="http://schemas.openxmlformats.org/drawingml/2006/picture">
+            <wp:extent cx="5303520" cy="3314700"/>
+            <wp:docPr id="10" name="Picture 10"/>
+            <wp:cNvGraphicFramePr>
+              <a:graphicFrameLocks noChangeAspect="1"/>
+            </wp:cNvGraphicFramePr>
+            <a:graphic>
+              <a:graphicData uri="http://schemas.openxmlformats.org/drawingml/2006/picture">
+                <pic:pic>
+                  <pic:nvPicPr>
+                    <pic:cNvPr id="0" name="kb10_size_limit.png"/>
+                    <pic:cNvPicPr/>
+                  </pic:nvPicPr>
+                  <pic:blipFill>
+                    <a:blip r:embed="rId18"/>
+                    <a:stretch>
+                      <a:fillRect/>
+                    </a:stretch>
+                  </pic:blipFill>
+                  <pic:spPr>
+                    <a:xfrm>
+                      <a:off x="0" y="0"/>
+                      <a:ext cx="5303520" cy="3314700"/>
+                    </a:xfrm>
+                    <a:prstGeom prst="rect"/>
+                  </pic:spPr>
+                </pic:pic>
+              </a:graphicData>
+            </a:graphic>
+          </wp:inline>
+        </w:drawing>
+      </w:r>
+    </w:p>
+    <w:p>
+      <w:pPr>
+        <w:jc w:val="center"/>
+      </w:pPr>
+      <w:r>
+        <w:rPr>
+          <w:i/>
+          <w:color w:val="505050"/>
+          <w:sz w:val="18"/>
+        </w:rPr>
+        <w:t>Hình 10 - KB10: Squid kiểm soát kích thước tải về (10MB/100MB cho phép HTTP 200; 110MB bị chặn HTTP 403 ERR_TOO_BIG)</w:t>
+      </w:r>
     </w:p>
     <w:sectPr>
       <w:pgSz w:w="11906" w:h="16838"/>

</xml_diff>